<commit_message>
Replace fabricated Yearley citation with verified precedents; reframe positioning
The load-bearing reference to Lee Yearley, "Job and Confucius," JRE 9.1
(1981): 107-22 could not be verified and is treated as fabricated. Replaced
it with three verified, on-theme sources (Perkins, Heaven and Earth Are Not
Humane, 2014; Back, "Confucian Heaven," EJPR 2016; Ing, The Vulnerability of
Integrity in Early Confucian Thought, 2017) and reframed the abstract,
introduction, and conclusion to position the essay as the first sustained
Job-Mengzi reading rather than three steps beyond Yearley. Removed the
orphan Chan (1963) entry. Bibliography now 19 entries; footnotes unchanged
at 20. Same abstract reframe applied to the BibInt title page. Regenerated
full/anon manuscripts and title page (docx + PDF).

Co-Authored-By: Claude Opus 4.7 <noreply@anthropic.com>
</commit_message>
<xml_diff>
--- a/job_mencius_paper_english_anon.docx
+++ b/job_mencius_paper_english_anon.docx
@@ -94,7 +94,7 @@
           <w:sz w:val="24"/>
           <w:szCs w:val="24"/>
         </w:rPr>
-        <w:t xml:space="preserve"> 6B15 (the fifteenth section of "Gaozi II") through cross-textual hermeneutics, arguing that the two texts generate not a synthesis but a productive tension over the role of suffering in moral formation. The most important precedent, Lee Yearley’s 1981 pairing of Job with Confucius, worked within an Aristotelian frame and concluded that virtue can be held independent of reward. I take three further steps: I replace that imported frame with Archie Lee’s cross-textual method, which lets each text argue in its own idiom; I substitute </w:t>
+        <w:t xml:space="preserve"> 6B15 (the fifteenth section of "Gaozi II") through cross-textual hermeneutics, arguing that the two texts generate not a synthesis but a productive tension over the role of suffering in moral formation. Although a mature literature now treats the problem of evil within classical Chinese philosophy, and comparative theology has refined its cross-textual methods, no sustained reading has yet set Job beside the </w:t>
       </w:r>
       <w:r>
         <w:rPr>
@@ -112,7 +112,25 @@
           <w:sz w:val="24"/>
           <w:szCs w:val="24"/>
         </w:rPr>
-        <w:t xml:space="preserve"> 6B15 for the </w:t>
+        <w:t xml:space="preserve"> on the question of how suffering forms character. This essay attempts that reading in three moves: it adopts Archie Lee’s cross-textual method, which lets each text argue in its own idiom; it takes </w:t>
+      </w:r>
+      <w:r>
+        <w:rPr>
+          <w:rFonts w:ascii="Times New Roman" w:cs="Times New Roman" w:eastAsia="Times New Roman" w:hAnsi="Times New Roman"/>
+          <w:i/>
+          <w:iCs/>
+          <w:sz w:val="24"/>
+          <w:szCs w:val="24"/>
+        </w:rPr>
+        <w:t xml:space="preserve">Mengzi</w:t>
+      </w:r>
+      <w:r>
+        <w:rPr>
+          <w:rFonts w:ascii="Times New Roman" w:cs="Times New Roman" w:eastAsia="Times New Roman" w:hAnsi="Times New Roman"/>
+          <w:sz w:val="24"/>
+          <w:szCs w:val="24"/>
+        </w:rPr>
+        <w:t xml:space="preserve"> 6B15, a passage far more explicit than the </w:t>
       </w:r>
       <w:r>
         <w:rPr>
@@ -130,7 +148,7 @@
           <w:sz w:val="24"/>
           <w:szCs w:val="24"/>
         </w:rPr>
-        <w:t xml:space="preserve">, a text far more explicit about the pedagogy of adversity; and I make Job 23:10 ("when he has tested me, I shall come out like gold," </w:t>
+        <w:t xml:space="preserve"> about the pedagogy of adversity, as the Confucian anchor; and it makes Job 23:10 ("when he has tested me, I shall come out like gold," </w:t>
       </w:r>
       <w:r>
         <w:rPr>
@@ -318,7 +336,7 @@
           <w:sz w:val="24"/>
           <w:szCs w:val="24"/>
         </w:rPr>
-        <w:t xml:space="preserve">The most important precedent is Lee Yearley’s "Job and Confucius," a genuinely pioneering piece.</w:t>
+        <w:t xml:space="preserve">Two bodies of scholarship bear directly on this project, yet they have not been brought into contact. On one side, a mature literature now examines the problem of evil and the moral operation of Heaven within classical Chinese philosophy itself, showing that early Confucian thought commands its own sophisticated resources for thinking about undeserved hardship.</w:t>
       </w:r>
       <w:r>
         <w:rPr>
@@ -332,43 +350,7 @@
           <w:sz w:val="24"/>
           <w:szCs w:val="24"/>
         </w:rPr>
-        <w:t xml:space="preserve"> Working with an Aristotelian account of the virtues, Yearley set Job’s protest beside sayings from the </w:t>
-      </w:r>
-      <w:r>
-        <w:rPr>
-          <w:rFonts w:ascii="Times New Roman" w:cs="Times New Roman" w:eastAsia="Times New Roman" w:hAnsi="Times New Roman"/>
-          <w:i/>
-          <w:iCs/>
-          <w:sz w:val="24"/>
-          <w:szCs w:val="24"/>
-        </w:rPr>
-        <w:t xml:space="preserve">Analects</w:t>
-      </w:r>
-      <w:r>
-        <w:rPr>
-          <w:rFonts w:ascii="Times New Roman" w:cs="Times New Roman" w:eastAsia="Times New Roman" w:hAnsi="Times New Roman"/>
-          <w:sz w:val="24"/>
-          <w:szCs w:val="24"/>
-        </w:rPr>
-        <w:t xml:space="preserve"> in which Confucius treats virtue as something held apart from any external payoff, and concluded that both traditions recognize a goodness that does not require the prop of reward. The insight still holds. But Yearley’s study labors under three limitations that the present essay is designed to address. The Aristotelian apparatus is a third term imposed from outside, not a category that either tradition generates from within. His Confucian text is the </w:t>
-      </w:r>
-      <w:r>
-        <w:rPr>
-          <w:rFonts w:ascii="Times New Roman" w:cs="Times New Roman" w:eastAsia="Times New Roman" w:hAnsi="Times New Roman"/>
-          <w:i/>
-          <w:iCs/>
-          <w:sz w:val="24"/>
-          <w:szCs w:val="24"/>
-        </w:rPr>
-        <w:t xml:space="preserve">Analects</w:t>
-      </w:r>
-      <w:r>
-        <w:rPr>
-          <w:rFonts w:ascii="Times New Roman" w:cs="Times New Roman" w:eastAsia="Times New Roman" w:hAnsi="Times New Roman"/>
-          <w:sz w:val="24"/>
-          <w:szCs w:val="24"/>
-        </w:rPr>
-        <w:t xml:space="preserve"> rather than the </w:t>
+        <w:t xml:space="preserve"> On the other, comparative theology and cross-textual hermeneutics have matured into disciplined methods for reading scriptures across traditions without dissolving one into another. What neither body of work has yet attempted is a sustained encounter between the book of Job and the </w:t>
       </w:r>
       <w:r>
         <w:rPr>
@@ -386,7 +368,7 @@
           <w:sz w:val="24"/>
           <w:szCs w:val="24"/>
         </w:rPr>
-        <w:t xml:space="preserve">, so that Mencius’s far more systematic and explicit account of the purpose of suffering never comes into view. And his comparison never reaches the mechanical question that animates this essay: </w:t>
+        <w:t xml:space="preserve"> on the precise question that animates this essay—not whether suffering is just, but </w:t>
       </w:r>
       <w:r>
         <w:rPr>
@@ -404,7 +386,7 @@
           <w:sz w:val="24"/>
           <w:szCs w:val="24"/>
         </w:rPr>
-        <w:t xml:space="preserve">, concretely, does suffering shape character?</w:t>
+        <w:t xml:space="preserve">, concretely, suffering forms moral character. That is the gap this essay sets out to fill.</w:t>
       </w:r>
     </w:p>
     <w:p>
@@ -418,7 +400,7 @@
           <w:sz w:val="24"/>
           <w:szCs w:val="24"/>
         </w:rPr>
-        <w:t xml:space="preserve">I take up Yearley’s problem and try to carry it three steps further. First, I replace the Aristotelian frame with Archie C. C. Lee’s cross-textual hermeneutics, which permits the two texts to converse within their own logics and so avoids both syncretism and false equivalence.</w:t>
+        <w:t xml:space="preserve">The inquiry proceeds in three deliberate moves. First, I adopt Archie C. C. Lee’s cross-textual hermeneutics, which permits the two texts to converse within their own logics and so avoids both syncretism and false equivalence.</w:t>
       </w:r>
       <w:r>
         <w:rPr>
@@ -2887,7 +2869,7 @@
           <w:sz w:val="24"/>
           <w:szCs w:val="24"/>
         </w:rPr>
-        <w:t xml:space="preserve"> The cross-cultural hermeneutic adopted here keeps theodical discourse open precisely by refusing the closure of any single system: Job’s apophatic tension and Mengzi’s teleological clarity hold each other in check, yielding a theodical stance that is more honest, more complex, and more answerable to the actual experience of suffering. This stance is also pointedly distinct from Yearley’s comparative frame. Yearley demonstrated, within an Aristotelian apparatus, that virtue can be held independent of reward; but the apparatus was imported, not grown from within either tradition. By letting the two traditions converse within their own logics, the present reading discloses each tradition’s own native response to suffering—and the productive tension their juxtaposition generates—rather than a shared conclusion underwritten by an external framework.</w:t>
+        <w:t xml:space="preserve"> The cross-cultural hermeneutic adopted here keeps theodical discourse open precisely by refusing the closure of any single system: Job’s apophatic tension and Mengzi’s teleological clarity hold each other in check, yielding a theodical stance that is more honest, more complex, and more answerable to the actual experience of suffering. This stance is also pointedly distinct from comparative approaches that adjudicate suffering through an imported third framework—an Aristotelian account of the virtues, say—whose categories neither tradition generates from within. By letting the two traditions converse within their own logics, the present reading discloses each tradition’s own native response to suffering—and the productive tension their juxtaposition generates—rather than a shared conclusion underwritten by an external framework.</w:t>
       </w:r>
       <w:r>
         <w:rPr>
@@ -3106,6 +3088,72 @@
           <w:sz w:val="24"/>
           <w:szCs w:val="24"/>
         </w:rPr>
+        <w:t xml:space="preserve">Back, Youngsun. "Confucian Heaven (</w:t>
+      </w:r>
+      <w:r>
+        <w:rPr>
+          <w:rFonts w:ascii="Times New Roman" w:eastAsia="Noto Sans CJK SC" w:hAnsi="Times New Roman"/>
+          <w:sz w:val="24"/>
+          <w:szCs w:val="24"/>
+        </w:rPr>
+        <w:t xml:space="preserve">天</w:t>
+      </w:r>
+      <w:r>
+        <w:rPr>
+          <w:rFonts w:ascii="Times New Roman" w:cs="Times New Roman" w:eastAsia="Times New Roman" w:hAnsi="Times New Roman"/>
+          <w:sz w:val="24"/>
+          <w:szCs w:val="24"/>
+        </w:rPr>
+        <w:t xml:space="preserve"> </w:t>
+      </w:r>
+      <w:r>
+        <w:rPr>
+          <w:rFonts w:ascii="Times New Roman" w:cs="Times New Roman" w:eastAsia="Times New Roman" w:hAnsi="Times New Roman"/>
+          <w:i/>
+          <w:iCs/>
+          <w:sz w:val="24"/>
+          <w:szCs w:val="24"/>
+        </w:rPr>
+        <w:t xml:space="preserve">Tian</w:t>
+      </w:r>
+      <w:r>
+        <w:rPr>
+          <w:rFonts w:ascii="Times New Roman" w:cs="Times New Roman" w:eastAsia="Times New Roman" w:hAnsi="Times New Roman"/>
+          <w:sz w:val="24"/>
+          <w:szCs w:val="24"/>
+        </w:rPr>
+        <w:t xml:space="preserve">): Moral Economy and Contingency." </w:t>
+      </w:r>
+      <w:r>
+        <w:rPr>
+          <w:rFonts w:ascii="Times New Roman" w:cs="Times New Roman" w:eastAsia="Times New Roman" w:hAnsi="Times New Roman"/>
+          <w:i/>
+          <w:iCs/>
+          <w:sz w:val="24"/>
+          <w:szCs w:val="24"/>
+        </w:rPr>
+        <w:t xml:space="preserve">European Journal for Philosophy of Religion</w:t>
+      </w:r>
+      <w:r>
+        <w:rPr>
+          <w:rFonts w:ascii="Times New Roman" w:cs="Times New Roman" w:eastAsia="Times New Roman" w:hAnsi="Times New Roman"/>
+          <w:sz w:val="24"/>
+          <w:szCs w:val="24"/>
+        </w:rPr>
+        <w:t xml:space="preserve"> 8, no. 1 (2016): 51–77.</w:t>
+      </w:r>
+    </w:p>
+    <w:p>
+      <w:pPr>
+        <w:spacing w:line="480" w:lineRule="auto"/>
+        <w:ind w:left="720" w:hanging="720"/>
+      </w:pPr>
+      <w:r>
+        <w:rPr>
+          <w:rFonts w:ascii="Times New Roman" w:cs="Times New Roman" w:eastAsia="Times New Roman" w:hAnsi="Times New Roman"/>
+          <w:sz w:val="24"/>
+          <w:szCs w:val="24"/>
+        </w:rPr>
         <w:t xml:space="preserve">Bloom, Irene. "Mencian Arguments on Human Nature (Jen-hsing)." </w:t>
       </w:r>
       <w:r>
@@ -3138,25 +3186,25 @@
           <w:sz w:val="24"/>
           <w:szCs w:val="24"/>
         </w:rPr>
-        <w:t xml:space="preserve">Chan, Wing-tsit. </w:t>
-      </w:r>
-      <w:r>
-        <w:rPr>
-          <w:rFonts w:ascii="Times New Roman" w:cs="Times New Roman" w:eastAsia="Times New Roman" w:hAnsi="Times New Roman"/>
-          <w:i/>
-          <w:iCs/>
-          <w:sz w:val="24"/>
-          <w:szCs w:val="24"/>
-        </w:rPr>
-        <w:t xml:space="preserve">A Source Book in Chinese Philosophy</w:t>
-      </w:r>
-      <w:r>
-        <w:rPr>
-          <w:rFonts w:ascii="Times New Roman" w:cs="Times New Roman" w:eastAsia="Times New Roman" w:hAnsi="Times New Roman"/>
-          <w:sz w:val="24"/>
-          <w:szCs w:val="24"/>
-        </w:rPr>
-        <w:t xml:space="preserve">. Princeton: Princeton University Press, 1963.</w:t>
+        <w:t xml:space="preserve">Clines, David J. A. </w:t>
+      </w:r>
+      <w:r>
+        <w:rPr>
+          <w:rFonts w:ascii="Times New Roman" w:cs="Times New Roman" w:eastAsia="Times New Roman" w:hAnsi="Times New Roman"/>
+          <w:i/>
+          <w:iCs/>
+          <w:sz w:val="24"/>
+          <w:szCs w:val="24"/>
+        </w:rPr>
+        <w:t xml:space="preserve">Job 38–42</w:t>
+      </w:r>
+      <w:r>
+        <w:rPr>
+          <w:rFonts w:ascii="Times New Roman" w:cs="Times New Roman" w:eastAsia="Times New Roman" w:hAnsi="Times New Roman"/>
+          <w:sz w:val="24"/>
+          <w:szCs w:val="24"/>
+        </w:rPr>
+        <w:t xml:space="preserve">. Word Biblical Commentary 18B. Nashville: Thomas Nelson, 2011.</w:t>
       </w:r>
     </w:p>
     <w:p>
@@ -3170,25 +3218,25 @@
           <w:sz w:val="24"/>
           <w:szCs w:val="24"/>
         </w:rPr>
-        <w:t xml:space="preserve">Clines, David J. A. </w:t>
-      </w:r>
-      <w:r>
-        <w:rPr>
-          <w:rFonts w:ascii="Times New Roman" w:cs="Times New Roman" w:eastAsia="Times New Roman" w:hAnsi="Times New Roman"/>
-          <w:i/>
-          <w:iCs/>
-          <w:sz w:val="24"/>
-          <w:szCs w:val="24"/>
-        </w:rPr>
-        <w:t xml:space="preserve">Job 38–42</w:t>
-      </w:r>
-      <w:r>
-        <w:rPr>
-          <w:rFonts w:ascii="Times New Roman" w:cs="Times New Roman" w:eastAsia="Times New Roman" w:hAnsi="Times New Roman"/>
-          <w:sz w:val="24"/>
-          <w:szCs w:val="24"/>
-        </w:rPr>
-        <w:t xml:space="preserve">. Word Biblical Commentary 18B. Nashville: Thomas Nelson, 2011.</w:t>
+        <w:t xml:space="preserve">Clooney, Francis X. </w:t>
+      </w:r>
+      <w:r>
+        <w:rPr>
+          <w:rFonts w:ascii="Times New Roman" w:cs="Times New Roman" w:eastAsia="Times New Roman" w:hAnsi="Times New Roman"/>
+          <w:i/>
+          <w:iCs/>
+          <w:sz w:val="24"/>
+          <w:szCs w:val="24"/>
+        </w:rPr>
+        <w:t xml:space="preserve">Comparative Theology: Deep Learning Across Religious Borders</w:t>
+      </w:r>
+      <w:r>
+        <w:rPr>
+          <w:rFonts w:ascii="Times New Roman" w:cs="Times New Roman" w:eastAsia="Times New Roman" w:hAnsi="Times New Roman"/>
+          <w:sz w:val="24"/>
+          <w:szCs w:val="24"/>
+        </w:rPr>
+        <w:t xml:space="preserve">. Malden, MA: Wiley-Blackwell, 2010.</w:t>
       </w:r>
     </w:p>
     <w:p>
@@ -3202,25 +3250,25 @@
           <w:sz w:val="24"/>
           <w:szCs w:val="24"/>
         </w:rPr>
-        <w:t xml:space="preserve">Clooney, Francis X. </w:t>
-      </w:r>
-      <w:r>
-        <w:rPr>
-          <w:rFonts w:ascii="Times New Roman" w:cs="Times New Roman" w:eastAsia="Times New Roman" w:hAnsi="Times New Roman"/>
-          <w:i/>
-          <w:iCs/>
-          <w:sz w:val="24"/>
-          <w:szCs w:val="24"/>
-        </w:rPr>
-        <w:t xml:space="preserve">Comparative Theology: Deep Learning Across Religious Borders</w:t>
-      </w:r>
-      <w:r>
-        <w:rPr>
-          <w:rFonts w:ascii="Times New Roman" w:cs="Times New Roman" w:eastAsia="Times New Roman" w:hAnsi="Times New Roman"/>
-          <w:sz w:val="24"/>
-          <w:szCs w:val="24"/>
-        </w:rPr>
-        <w:t xml:space="preserve">. Malden, MA: Wiley-Blackwell, 2010.</w:t>
+        <w:t xml:space="preserve">Graham, A. C. </w:t>
+      </w:r>
+      <w:r>
+        <w:rPr>
+          <w:rFonts w:ascii="Times New Roman" w:cs="Times New Roman" w:eastAsia="Times New Roman" w:hAnsi="Times New Roman"/>
+          <w:i/>
+          <w:iCs/>
+          <w:sz w:val="24"/>
+          <w:szCs w:val="24"/>
+        </w:rPr>
+        <w:t xml:space="preserve">Disputers of the Tao: Philosophical Argument in Ancient China</w:t>
+      </w:r>
+      <w:r>
+        <w:rPr>
+          <w:rFonts w:ascii="Times New Roman" w:cs="Times New Roman" w:eastAsia="Times New Roman" w:hAnsi="Times New Roman"/>
+          <w:sz w:val="24"/>
+          <w:szCs w:val="24"/>
+        </w:rPr>
+        <w:t xml:space="preserve">. La Salle, IL: Open Court, 1989.</w:t>
       </w:r>
     </w:p>
     <w:p>
@@ -3234,25 +3282,25 @@
           <w:sz w:val="24"/>
           <w:szCs w:val="24"/>
         </w:rPr>
-        <w:t xml:space="preserve">Graham, A. C. </w:t>
-      </w:r>
-      <w:r>
-        <w:rPr>
-          <w:rFonts w:ascii="Times New Roman" w:cs="Times New Roman" w:eastAsia="Times New Roman" w:hAnsi="Times New Roman"/>
-          <w:i/>
-          <w:iCs/>
-          <w:sz w:val="24"/>
-          <w:szCs w:val="24"/>
-        </w:rPr>
-        <w:t xml:space="preserve">Disputers of the Tao: Philosophical Argument in Ancient China</w:t>
-      </w:r>
-      <w:r>
-        <w:rPr>
-          <w:rFonts w:ascii="Times New Roman" w:cs="Times New Roman" w:eastAsia="Times New Roman" w:hAnsi="Times New Roman"/>
-          <w:sz w:val="24"/>
-          <w:szCs w:val="24"/>
-        </w:rPr>
-        <w:t xml:space="preserve">. La Salle, IL: Open Court, 1989.</w:t>
+        <w:t xml:space="preserve">Habel, Norman C. </w:t>
+      </w:r>
+      <w:r>
+        <w:rPr>
+          <w:rFonts w:ascii="Times New Roman" w:cs="Times New Roman" w:eastAsia="Times New Roman" w:hAnsi="Times New Roman"/>
+          <w:i/>
+          <w:iCs/>
+          <w:sz w:val="24"/>
+          <w:szCs w:val="24"/>
+        </w:rPr>
+        <w:t xml:space="preserve">The Book of Job: A Commentary</w:t>
+      </w:r>
+      <w:r>
+        <w:rPr>
+          <w:rFonts w:ascii="Times New Roman" w:cs="Times New Roman" w:eastAsia="Times New Roman" w:hAnsi="Times New Roman"/>
+          <w:sz w:val="24"/>
+          <w:szCs w:val="24"/>
+        </w:rPr>
+        <w:t xml:space="preserve">. Old Testament Library. Philadelphia: Westminster, 1985.</w:t>
       </w:r>
     </w:p>
     <w:p>
@@ -3266,25 +3314,25 @@
           <w:sz w:val="24"/>
           <w:szCs w:val="24"/>
         </w:rPr>
-        <w:t xml:space="preserve">Habel, Norman C. </w:t>
-      </w:r>
-      <w:r>
-        <w:rPr>
-          <w:rFonts w:ascii="Times New Roman" w:cs="Times New Roman" w:eastAsia="Times New Roman" w:hAnsi="Times New Roman"/>
-          <w:i/>
-          <w:iCs/>
-          <w:sz w:val="24"/>
-          <w:szCs w:val="24"/>
-        </w:rPr>
-        <w:t xml:space="preserve">The Book of Job: A Commentary</w:t>
-      </w:r>
-      <w:r>
-        <w:rPr>
-          <w:rFonts w:ascii="Times New Roman" w:cs="Times New Roman" w:eastAsia="Times New Roman" w:hAnsi="Times New Roman"/>
-          <w:sz w:val="24"/>
-          <w:szCs w:val="24"/>
-        </w:rPr>
-        <w:t xml:space="preserve">. Old Testament Library. Philadelphia: Westminster, 1985.</w:t>
+        <w:t xml:space="preserve">Ing, Michael D. K. </w:t>
+      </w:r>
+      <w:r>
+        <w:rPr>
+          <w:rFonts w:ascii="Times New Roman" w:cs="Times New Roman" w:eastAsia="Times New Roman" w:hAnsi="Times New Roman"/>
+          <w:i/>
+          <w:iCs/>
+          <w:sz w:val="24"/>
+          <w:szCs w:val="24"/>
+        </w:rPr>
+        <w:t xml:space="preserve">The Vulnerability of Integrity in Early Confucian Thought</w:t>
+      </w:r>
+      <w:r>
+        <w:rPr>
+          <w:rFonts w:ascii="Times New Roman" w:cs="Times New Roman" w:eastAsia="Times New Roman" w:hAnsi="Times New Roman"/>
+          <w:sz w:val="24"/>
+          <w:szCs w:val="24"/>
+        </w:rPr>
+        <w:t xml:space="preserve">. New York: Oxford University Press, 2017.</w:t>
       </w:r>
     </w:p>
     <w:p>
@@ -3426,6 +3474,38 @@
           <w:sz w:val="24"/>
           <w:szCs w:val="24"/>
         </w:rPr>
+        <w:t xml:space="preserve">Perkins, Franklin. </w:t>
+      </w:r>
+      <w:r>
+        <w:rPr>
+          <w:rFonts w:ascii="Times New Roman" w:cs="Times New Roman" w:eastAsia="Times New Roman" w:hAnsi="Times New Roman"/>
+          <w:i/>
+          <w:iCs/>
+          <w:sz w:val="24"/>
+          <w:szCs w:val="24"/>
+        </w:rPr>
+        <w:t xml:space="preserve">Heaven and Earth Are Not Humane: The Problem of Evil in Classical Chinese Philosophy</w:t>
+      </w:r>
+      <w:r>
+        <w:rPr>
+          <w:rFonts w:ascii="Times New Roman" w:cs="Times New Roman" w:eastAsia="Times New Roman" w:hAnsi="Times New Roman"/>
+          <w:sz w:val="24"/>
+          <w:szCs w:val="24"/>
+        </w:rPr>
+        <w:t xml:space="preserve">. Bloomington: Indiana University Press, 2014.</w:t>
+      </w:r>
+    </w:p>
+    <w:p>
+      <w:pPr>
+        <w:spacing w:line="480" w:lineRule="auto"/>
+        <w:ind w:left="720" w:hanging="720"/>
+      </w:pPr>
+      <w:r>
+        <w:rPr>
+          <w:rFonts w:ascii="Times New Roman" w:cs="Times New Roman" w:eastAsia="Times New Roman" w:hAnsi="Times New Roman"/>
+          <w:sz w:val="24"/>
+          <w:szCs w:val="24"/>
+        </w:rPr>
         <w:t xml:space="preserve">Seneca, Lucius Annaeus. </w:t>
       </w:r>
       <w:r>
@@ -3623,38 +3703,6 @@
           <w:szCs w:val="24"/>
         </w:rPr>
         <w:t xml:space="preserve">. Indianapolis: Hackett, 2008.</w:t>
-      </w:r>
-    </w:p>
-    <w:p>
-      <w:pPr>
-        <w:spacing w:line="480" w:lineRule="auto"/>
-        <w:ind w:left="720" w:hanging="720"/>
-      </w:pPr>
-      <w:r>
-        <w:rPr>
-          <w:rFonts w:ascii="Times New Roman" w:cs="Times New Roman" w:eastAsia="Times New Roman" w:hAnsi="Times New Roman"/>
-          <w:sz w:val="24"/>
-          <w:szCs w:val="24"/>
-        </w:rPr>
-        <w:t xml:space="preserve">Yearley, Lee H. "Job and Confucius." </w:t>
-      </w:r>
-      <w:r>
-        <w:rPr>
-          <w:rFonts w:ascii="Times New Roman" w:cs="Times New Roman" w:eastAsia="Times New Roman" w:hAnsi="Times New Roman"/>
-          <w:i/>
-          <w:iCs/>
-          <w:sz w:val="24"/>
-          <w:szCs w:val="24"/>
-        </w:rPr>
-        <w:t xml:space="preserve">Journal of Religious Ethics</w:t>
-      </w:r>
-      <w:r>
-        <w:rPr>
-          <w:rFonts w:ascii="Times New Roman" w:cs="Times New Roman" w:eastAsia="Times New Roman" w:hAnsi="Times New Roman"/>
-          <w:sz w:val="24"/>
-          <w:szCs w:val="24"/>
-        </w:rPr>
-        <w:t xml:space="preserve"> 9, no. 1 (1981): 107–22.</w:t>
       </w:r>
     </w:p>
     <w:p>
@@ -3848,61 +3896,95 @@
           <w:sz w:val="20"/>
           <w:szCs w:val="20"/>
         </w:rPr>
-        <w:t xml:space="preserve">Lee H. Yearley, "Job and Confucius," </w:t>
-      </w:r>
-      <w:r>
-        <w:rPr>
-          <w:rFonts w:ascii="Times New Roman" w:cs="Times New Roman" w:eastAsia="Times New Roman" w:hAnsi="Times New Roman"/>
-          <w:i/>
-          <w:iCs/>
-          <w:sz w:val="20"/>
-          <w:szCs w:val="20"/>
-        </w:rPr>
-        <w:t xml:space="preserve">Journal of Religious Ethics</w:t>
-      </w:r>
-      <w:r>
-        <w:rPr>
-          <w:rFonts w:ascii="Times New Roman" w:cs="Times New Roman" w:eastAsia="Times New Roman" w:hAnsi="Times New Roman"/>
-          <w:sz w:val="20"/>
-          <w:szCs w:val="20"/>
-        </w:rPr>
-        <w:t xml:space="preserve"> 9, no. 1 (1981): 107–22. Yearley pairs Job with the </w:t>
-      </w:r>
-      <w:r>
-        <w:rPr>
-          <w:rFonts w:ascii="Times New Roman" w:cs="Times New Roman" w:eastAsia="Times New Roman" w:hAnsi="Times New Roman"/>
-          <w:i/>
-          <w:iCs/>
-          <w:sz w:val="20"/>
-          <w:szCs w:val="20"/>
-        </w:rPr>
-        <w:t xml:space="preserve">Analects</w:t>
-      </w:r>
-      <w:r>
-        <w:rPr>
-          <w:rFonts w:ascii="Times New Roman" w:cs="Times New Roman" w:eastAsia="Times New Roman" w:hAnsi="Times New Roman"/>
-          <w:sz w:val="20"/>
-          <w:szCs w:val="20"/>
-        </w:rPr>
-        <w:t xml:space="preserve"> rather than the </w:t>
-      </w:r>
-      <w:r>
-        <w:rPr>
-          <w:rFonts w:ascii="Times New Roman" w:cs="Times New Roman" w:eastAsia="Times New Roman" w:hAnsi="Times New Roman"/>
-          <w:i/>
-          <w:iCs/>
-          <w:sz w:val="20"/>
-          <w:szCs w:val="20"/>
-        </w:rPr>
-        <w:t xml:space="preserve">Mengzi</w:t>
-      </w:r>
-      <w:r>
-        <w:rPr>
-          <w:rFonts w:ascii="Times New Roman" w:cs="Times New Roman" w:eastAsia="Times New Roman" w:hAnsi="Times New Roman"/>
-          <w:sz w:val="20"/>
-          <w:szCs w:val="20"/>
-        </w:rPr>
-        <w:t xml:space="preserve">, and reads both through an Aristotelian lens.</w:t>
+        <w:t xml:space="preserve">On the problem of evil and the moral operation of Heaven in classical Chinese thought, see Franklin Perkins, </w:t>
+      </w:r>
+      <w:r>
+        <w:rPr>
+          <w:rFonts w:ascii="Times New Roman" w:cs="Times New Roman" w:eastAsia="Times New Roman" w:hAnsi="Times New Roman"/>
+          <w:i/>
+          <w:iCs/>
+          <w:sz w:val="20"/>
+          <w:szCs w:val="20"/>
+        </w:rPr>
+        <w:t xml:space="preserve">Heaven and Earth Are Not Humane: The Problem of Evil in Classical Chinese Philosophy</w:t>
+      </w:r>
+      <w:r>
+        <w:rPr>
+          <w:rFonts w:ascii="Times New Roman" w:cs="Times New Roman" w:eastAsia="Times New Roman" w:hAnsi="Times New Roman"/>
+          <w:sz w:val="20"/>
+          <w:szCs w:val="20"/>
+        </w:rPr>
+        <w:t xml:space="preserve"> (Bloomington: Indiana University Press, 2014); and Youngsun Back, "Confucian Heaven (</w:t>
+      </w:r>
+      <w:r>
+        <w:rPr>
+          <w:rFonts w:ascii="Times New Roman" w:eastAsia="Noto Sans CJK SC" w:hAnsi="Times New Roman"/>
+          <w:sz w:val="20"/>
+          <w:szCs w:val="20"/>
+        </w:rPr>
+        <w:t xml:space="preserve">天</w:t>
+      </w:r>
+      <w:r>
+        <w:rPr>
+          <w:rFonts w:ascii="Times New Roman" w:cs="Times New Roman" w:eastAsia="Times New Roman" w:hAnsi="Times New Roman"/>
+          <w:sz w:val="20"/>
+          <w:szCs w:val="20"/>
+        </w:rPr>
+        <w:t xml:space="preserve"> </w:t>
+      </w:r>
+      <w:r>
+        <w:rPr>
+          <w:rFonts w:ascii="Times New Roman" w:cs="Times New Roman" w:eastAsia="Times New Roman" w:hAnsi="Times New Roman"/>
+          <w:i/>
+          <w:iCs/>
+          <w:sz w:val="20"/>
+          <w:szCs w:val="20"/>
+        </w:rPr>
+        <w:t xml:space="preserve">Tian</w:t>
+      </w:r>
+      <w:r>
+        <w:rPr>
+          <w:rFonts w:ascii="Times New Roman" w:cs="Times New Roman" w:eastAsia="Times New Roman" w:hAnsi="Times New Roman"/>
+          <w:sz w:val="20"/>
+          <w:szCs w:val="20"/>
+        </w:rPr>
+        <w:t xml:space="preserve">): Moral Economy and Contingency," </w:t>
+      </w:r>
+      <w:r>
+        <w:rPr>
+          <w:rFonts w:ascii="Times New Roman" w:cs="Times New Roman" w:eastAsia="Times New Roman" w:hAnsi="Times New Roman"/>
+          <w:i/>
+          <w:iCs/>
+          <w:sz w:val="20"/>
+          <w:szCs w:val="20"/>
+        </w:rPr>
+        <w:t xml:space="preserve">European Journal for Philosophy of Religion</w:t>
+      </w:r>
+      <w:r>
+        <w:rPr>
+          <w:rFonts w:ascii="Times New Roman" w:cs="Times New Roman" w:eastAsia="Times New Roman" w:hAnsi="Times New Roman"/>
+          <w:sz w:val="20"/>
+          <w:szCs w:val="20"/>
+        </w:rPr>
+        <w:t xml:space="preserve"> 8, no. 1 (2016): 51–77. On the vulnerability of moral integrity to circumstance in early Confucian thought, see Michael D. K. Ing, </w:t>
+      </w:r>
+      <w:r>
+        <w:rPr>
+          <w:rFonts w:ascii="Times New Roman" w:cs="Times New Roman" w:eastAsia="Times New Roman" w:hAnsi="Times New Roman"/>
+          <w:i/>
+          <w:iCs/>
+          <w:sz w:val="20"/>
+          <w:szCs w:val="20"/>
+        </w:rPr>
+        <w:t xml:space="preserve">The Vulnerability of Integrity in Early Confucian Thought</w:t>
+      </w:r>
+      <w:r>
+        <w:rPr>
+          <w:rFonts w:ascii="Times New Roman" w:cs="Times New Roman" w:eastAsia="Times New Roman" w:hAnsi="Times New Roman"/>
+          <w:sz w:val="20"/>
+          <w:szCs w:val="20"/>
+        </w:rPr>
+        <w:t xml:space="preserve"> (New York: Oxford University Press, 2017). None of these studies sets the Confucian material beside the book of Job.</w:t>
       </w:r>
     </w:p>
   </w:footnote>

</xml_diff>